<commit_message>
Add revised abstract to draft
Co-Authored-By: Claude Sonnet 5.5 <noreply@anthropic.com>
Claude-Session: https://claude.ai/code/session_019ks96x9sC8NinrPq6pHnnp
</commit_message>
<xml_diff>
--- a/ISR_intro_ch2_revised.docx
+++ b/ISR_intro_ch2_revised.docx
@@ -13,6 +13,12 @@
         <w:t xml:space="preserve"> </w:t>
       </w:r>
       <w:r>
+        <w:t xml:space="preserve">Abstract,</w:t>
+      </w:r>
+      <w:r>
+        <w:t xml:space="preserve"> </w:t>
+      </w:r>
+      <w:r>
         <w:t xml:space="preserve">Introduction</w:t>
       </w:r>
       <w:r>
@@ -43,22 +49,36 @@
         <w:t xml:space="preserve"> </w:t>
       </w:r>
       <w:r>
-        <w:t xml:space="preserve">5,</w:t>
-      </w:r>
-      <w:r>
-        <w:t xml:space="preserve"> </w:t>
-      </w:r>
-      <w:r>
-        <w:t xml:space="preserve">sections</w:t>
-      </w:r>
-      <w:r>
-        <w:t xml:space="preserve"> </w:t>
-      </w:r>
-      <w:r>
-        <w:t xml:space="preserve">1–2)</w:t>
-      </w:r>
-    </w:p>
-    <w:bookmarkStart w:id="20" w:name="introduction"/>
+        <w:t xml:space="preserve">5)</w:t>
+      </w:r>
+    </w:p>
+    <w:bookmarkStart w:id="20" w:name="abstract"/>
+    <w:p>
+      <w:pPr>
+        <w:pStyle w:val="Heading1"/>
+      </w:pPr>
+      <w:r>
+        <w:t xml:space="preserve">Abstract</w:t>
+      </w:r>
+    </w:p>
+    <w:p>
+      <w:pPr>
+        <w:pStyle w:val="FirstParagraph"/>
+      </w:pPr>
+      <w:r>
+        <w:t xml:space="preserve">Organizations are beginning to let networks of large language model (LLM) agents allocate scarce resources among themselves, yet little is known about how the governance rules built into such systems shape who ends up in control. IT governance theory assumes that a decision right and its exercise are separable, with the gap filled by human norms and interests. We ask what fills that gap when the right holders are agents, and contrast a capture logic, in which office converts into advantage and entrenchment, with a specification logic, in which stated incentives and model dispositions govern behavior. In a controlled simulation of 168 agent worlds, we varied binding allocation authority, the rewards attached to office, the election rule, and the model composition of the population, and computed every outcome from logged events rather than agent discourse. Office rents sharply increased candidacy and competition, but not inequality of access. Binding authority made allocation more equal than chance, because holders favored agents with fewer tasks and less energy and gave themselves less, not more. Election rules made no detectable difference. Model family and capability predicted who stood for office, more than who won. Contest for office did not convert into capture of access, which bounds the capture logic in this environment. The specification account was developed after the main results and awaits replication.</w:t>
+      </w:r>
+    </w:p>
+    <w:p>
+      <w:pPr>
+        <w:pStyle w:val="BodyText"/>
+      </w:pPr>
+      <w:r>
+        <w:t xml:space="preserve">Keywords: agentic information systems; IT governance; decision rights; large language model agents; multi-agent simulation; office rents</w:t>
+      </w:r>
+    </w:p>
+    <w:bookmarkEnd w:id="20"/>
+    <w:bookmarkStart w:id="21" w:name="introduction"/>
     <w:p>
       <w:pPr>
         <w:pStyle w:val="Heading1"/>
@@ -147,8 +167,8 @@
         <w:t xml:space="preserve">The paper proceeds as follows. Section 2 develops the two logics and the propositions. Section 3 describes the environment, design, and measures. Section 4 reports results, Section 5 discusses implications and limits, and Section 6 concludes.</w:t>
       </w:r>
     </w:p>
-    <w:bookmarkEnd w:id="20"/>
-    <w:bookmarkStart w:id="27" w:name="theoretical-background-and-propositions"/>
+    <w:bookmarkEnd w:id="21"/>
+    <w:bookmarkStart w:id="28" w:name="theoretical-background-and-propositions"/>
     <w:p>
       <w:pPr>
         <w:pStyle w:val="Heading1"/>
@@ -157,7 +177,7 @@
         <w:t xml:space="preserve">2. Theoretical Background and Propositions</w:t>
       </w:r>
     </w:p>
-    <w:bookmarkStart w:id="21" w:name="decision-rights-and-the-exercise-gap"/>
+    <w:bookmarkStart w:id="22" w:name="decision-rights-and-the-exercise-gap"/>
     <w:p>
       <w:pPr>
         <w:pStyle w:val="Heading2"/>
@@ -187,8 +207,8 @@
         <w:t xml:space="preserve">. In human organizations the exercise gap is filled by the holder’s own interests, by professional and social norms, and by reputation, which together moderate how far formal authority is turned into advantage.</w:t>
       </w:r>
     </w:p>
-    <w:bookmarkEnd w:id="21"/>
-    <w:bookmarkStart w:id="22" w:name="delegation-to-and-among-agentic-systems"/>
+    <w:bookmarkEnd w:id="22"/>
+    <w:bookmarkStart w:id="23" w:name="delegation-to-and-among-agentic-systems"/>
     <w:p>
       <w:pPr>
         <w:pStyle w:val="Heading2"/>
@@ -213,8 +233,8 @@
         <w:t xml:space="preserve">The theoretical issue is what fills the exercise gap when the right holders are LLM agents. Two candidate fillers can be distinguished. One is the set of incentives that the system specification states explicitly. The other is the dispositions that the underlying model brings to the task, which vary across model families and capability levels. Agents have no career, no standing in a community, and few loyalties beyond those the system records. Whether the human fillers of the gap are replaced by these two, or whether agents reproduce the dynamics that human accounts predict, is the open question this paper addresses.</w:t>
       </w:r>
     </w:p>
-    <w:bookmarkEnd w:id="22"/>
-    <w:bookmarkStart w:id="23" w:name="two-logics-of-control-among-agents"/>
+    <w:bookmarkEnd w:id="23"/>
+    <w:bookmarkStart w:id="24" w:name="two-logics-of-control-among-agents"/>
     <w:p>
       <w:pPr>
         <w:pStyle w:val="Heading2"/>
@@ -277,8 +297,8 @@
         <w:t xml:space="preserve">Both logics predict that rewards for office draw candidates, and both predict that model characteristics shape who stands. They diverge on exercise (does binding authority concentrate access?), on whether rents amplify that effect, and on entrenchment (do election rules affect persistence of control?). We therefore treat the exercise and entrenchment stages as the diagnostic ones. We stated the capture-logic propositions below before examining the outcomes. The specification logic was developed more fully after the main results, and Section 3.5 and Section 5.1 identify which analyses were exploratory.</w:t>
       </w:r>
     </w:p>
-    <w:bookmarkEnd w:id="23"/>
-    <w:bookmarkStart w:id="24" w:name="constructs"/>
+    <w:bookmarkEnd w:id="24"/>
+    <w:bookmarkStart w:id="25" w:name="constructs"/>
     <w:p>
       <w:pPr>
         <w:pStyle w:val="Heading2"/>
@@ -357,8 +377,8 @@
         <w:t xml:space="preserve">Agent capability and model family, which determine the dispositions agents bring to the task, enter as the fourth design feature.</w:t>
       </w:r>
     </w:p>
-    <w:bookmarkEnd w:id="24"/>
-    <w:bookmarkStart w:id="25" w:name="a-three-stage-model-and-propositions"/>
+    <w:bookmarkEnd w:id="25"/>
+    <w:bookmarkStart w:id="26" w:name="a-three-stage-model-and-propositions"/>
     <w:p>
       <w:pPr>
         <w:pStyle w:val="Heading2"/>
@@ -868,8 +888,8 @@
         <w:t xml:space="preserve">Table A. Predictions of the two logics for each proposition.</w:t>
       </w:r>
     </w:p>
-    <w:bookmarkEnd w:id="25"/>
-    <w:bookmarkStart w:id="26" w:name="mechanism-statements-post-hoc"/>
+    <w:bookmarkEnd w:id="26"/>
+    <w:bookmarkStart w:id="27" w:name="mechanism-statements-post-hoc"/>
     <w:p>
       <w:pPr>
         <w:pStyle w:val="Heading2"/>
@@ -960,8 +980,8 @@
         <w:t xml:space="preserve">Each statement can fail. The first fails if rewards for office do not raise candidacy across model families. The second fails if holders favor themselves or past benefactors once the prompt makes their own interest salient. The third fails if differences between models appear mainly in success among candidates. The fourth fails if enabling reasoning makes election rules or vote-for-access exchange matter. Section 5.1 reports how far the data support each statement.</w:t>
       </w:r>
     </w:p>
-    <w:bookmarkEnd w:id="26"/>
     <w:bookmarkEnd w:id="27"/>
+    <w:bookmarkEnd w:id="28"/>
     <w:sectPr/>
   </w:body>
 </w:document>

</xml_diff>

<commit_message>
Add revised section 5.1 to draft
Co-Authored-By: Claude Sonnet 5.5 <noreply@anthropic.com>
Claude-Session: https://claude.ai/code/session_019ks96x9sC8NinrPq6pHnnp
</commit_message>
<xml_diff>
--- a/ISR_intro_ch2_revised.docx
+++ b/ISR_intro_ch2_revised.docx
@@ -982,6 +982,140 @@
     </w:p>
     <w:bookmarkEnd w:id="27"/>
     <w:bookmarkEnd w:id="28"/>
+    <w:bookmarkStart w:id="30" w:name="discussion"/>
+    <w:p>
+      <w:pPr>
+        <w:pStyle w:val="Heading1"/>
+      </w:pPr>
+      <w:r>
+        <w:t xml:space="preserve">5. Discussion</w:t>
+      </w:r>
+    </w:p>
+    <w:bookmarkStart w:id="29" w:name="what-the-results-say"/>
+    <w:p>
+      <w:pPr>
+        <w:pStyle w:val="Heading2"/>
+      </w:pPr>
+      <w:r>
+        <w:t xml:space="preserve">5.1 What the results say</w:t>
+      </w:r>
+    </w:p>
+    <w:p>
+      <w:pPr>
+        <w:pStyle w:val="FirstParagraph"/>
+      </w:pPr>
+      <w:r>
+        <w:t xml:space="preserve">The results adjudicate between the two logics stage by stage. They support the capture logic only at the first stage, where it makes the same prediction as the specification logic, and they favor the specification logic at the stages where the two diverge.</w:t>
+      </w:r>
+    </w:p>
+    <w:p>
+      <w:pPr>
+        <w:pStyle w:val="BodyText"/>
+      </w:pPr>
+      <w:r>
+        <w:rPr>
+          <w:bCs/>
+          <w:b/>
+        </w:rPr>
+        <w:t xml:space="preserve">Selection (contest).</w:t>
+      </w:r>
+      <w:r>
+        <w:t xml:space="preserve"> </w:t>
+      </w:r>
+      <w:r>
+        <w:t xml:space="preserve">Rewards attached to office determined whether agents competed for it. Rents lowered the share of elections with no candidate from 55 to 34 percent and raised the odds of standing by a factor of 1.7 (P1). Candidacy also followed the pattern that cumulative-advantage accounts imply: agents who held office at the previous election had 2.9 times the odds of standing again, and agents with more energy than their peers were more likely to stand. Who stood depended strongly on the model, with Claude agents standing at about a quarter of the odds of DeepSeek agents, and, within the DeepSeek family, on capability. The family difference was one of candidacy and not of success once standing (26 wins in 62 contested elections against 25.6 expected). For capability, the stronger model both stood more often and won somewhat more often than expected (47 wins against 38.4 expected; P5). The exploratory interaction with authority complicates a purely dispositional reading. Binding authority lowered the share of elections with no candidate in DeepSeek-only worlds (35 to 20 percent) and raised it in Claude-only worlds (66 to 75 percent), and we offer no account of that difference.</w:t>
+      </w:r>
+    </w:p>
+    <w:p>
+      <w:pPr>
+        <w:pStyle w:val="BodyText"/>
+      </w:pPr>
+      <w:r>
+        <w:rPr>
+          <w:bCs/>
+          <w:b/>
+        </w:rPr>
+        <w:t xml:space="preserve">Exercise (capture).</w:t>
+      </w:r>
+      <w:r>
+        <w:t xml:space="preserve"> </w:t>
+      </w:r>
+      <w:r>
+        <w:t xml:space="preserve">Here the logics diverge, and the data favor the specification logic. Binding authority did not concentrate access; the Gini of tasks was lower than the random benchmark (0.082 against 0.103), so P2 is contradicted. Table 2 indicates why. Holders favored agents with fewer tasks and less energy, gave themselves less and not more, and did not favor agents who had earlier given them energy in a way we can distinguish from zero. This is the equity default of Section 2.6, and it means that in this environment the conversion of office into advantage, on which the capture chain depends, did not operate. Cumulative advantage appeared in who stood, but not in who received tasks. Rents did not strengthen the effect of authority on inequality (P3: the interaction on the Gini was negligible), although the longest spell without a task shortened by about two days under binding authority when office carried no rents and not at all when it did (difference in differences of 2.6 days, p = 0.055). We read this as suggestive. The coefficient for self-allocation was more negative with rents (−0.88) than without (−0.25), which runs against the expectation that rents tempt holders, and we note the direction without interpreting the difference between rent conditions further. These allocation estimates rest on the 70 worlds in which the office was filled under binding authority, so we treat them as exploratory.</w:t>
+      </w:r>
+    </w:p>
+    <w:p>
+      <w:pPr>
+        <w:pStyle w:val="BodyText"/>
+      </w:pPr>
+      <w:r>
+        <w:rPr>
+          <w:bCs/>
+          <w:b/>
+        </w:rPr>
+        <w:t xml:space="preserve">Entrenchment (persistence).</w:t>
+      </w:r>
+      <w:r>
+        <w:t xml:space="preserve"> </w:t>
+      </w:r>
+      <w:r>
+        <w:t xml:space="preserve">Persistence of control did not respond to authority or to the election rule. P4 is not supported: plurality and ranked-choice produced indistinguishable outcomes, and the largest gap, in re-election, ran in the opposite direction. The observation that agents often held office for stretches of ten days or more is easily over-read. A considerable part of that persistence in the pilot reflected incumbents continuing by default when nobody stood. After correcting for this, the longest holder spells (8.1 to 12.4 days, against terms of five days) correspond to two or three consecutive terms, which is moderate. The longer spells under rents are consistent with more agents contesting an office that is worth holding, but we did not test mediation through candidacy, so that path is inferred from the main effects and not estimated. The placebo comparison also shows that the high count of voters who backed a winner after receiving a gift reflects a high base rate of giving and not an exchange of votes for access.</w:t>
+      </w:r>
+    </w:p>
+    <w:p>
+      <w:pPr>
+        <w:pStyle w:val="BodyText"/>
+      </w:pPr>
+      <w:r>
+        <w:rPr>
+          <w:bCs/>
+          <w:b/>
+        </w:rPr>
+        <w:t xml:space="preserve">The four mechanism statements.</w:t>
+      </w:r>
+      <w:r>
+        <w:t xml:space="preserve"> </w:t>
+      </w:r>
+      <w:r>
+        <w:t xml:space="preserve">Incentive responsiveness is supported: rents raised candidacy, and no rival explanation appears in the data. The equity default is supported by Table 2 within the filled-office subset. Dispositional selection is supported for model family and modestly for capability, subject to the unexplained interaction above. Limited strategic depth is consistent with the null results for election rules and for vote-for-access exchange, but we did not vary reasoning, so the data cannot show that depth is the explanation. All four statements were formed after the data were seen and remain to be tested on new data.</w:t>
+      </w:r>
+    </w:p>
+    <w:p>
+      <w:pPr>
+        <w:pStyle w:val="BodyText"/>
+      </w:pPr>
+      <w:r>
+        <w:rPr>
+          <w:bCs/>
+          <w:b/>
+        </w:rPr>
+        <w:t xml:space="preserve">Summary of propositions.</w:t>
+      </w:r>
+      <w:r>
+        <w:t xml:space="preserve"> </w:t>
+      </w:r>
+      <w:r>
+        <w:t xml:space="preserve">Figure 2 maps the results onto the same structure. Of the five propositions, P1 is supported; P5 is supported with respect to who stands and only weakly with respect to who wins; P4 is not supported; P2 is contradicted, since binding authority reduced inequality of access measured by the Gini coefficient and did not affect the persistence of control; and P3 receives only suggestive support, in the form of a loss of the exclusion benefit under rents. For designers the result locates the lever. The rents attached to a position, and not the authority attached to it, determine whether it becomes contested, and whether contest turns into capture depends on what fills the exercise gap. In this environment the agents answered that question mostly in the negative.</w:t>
+      </w:r>
+    </w:p>
+    <w:p>
+      <w:pPr>
+        <w:pStyle w:val="BodyText"/>
+      </w:pPr>
+      <w:r>
+        <w:t xml:space="preserve">[Path diagram of the empirical results, arranged in the same three stages: supported, null, and suggestive paths between the constructs of the conceptual model.]</w:t>
+      </w:r>
+    </w:p>
+    <w:p>
+      <w:pPr>
+        <w:pStyle w:val="BodyText"/>
+      </w:pPr>
+      <w:r>
+        <w:t xml:space="preserve">Figure 2. Empirical support for the model (168 worlds). Solid arrows indicate supported effects, dashed grey arrows no detectable effect, and the dotted arrow a weak or suggestive moderation. Authority binding had no detectable effect on persistence of control. Mediation by candidacy was not tested.</w:t>
+      </w:r>
+    </w:p>
+    <w:bookmarkEnd w:id="29"/>
+    <w:bookmarkEnd w:id="30"/>
     <w:sectPr/>
   </w:body>
 </w:document>

</xml_diff>